<commit_message>
docs: VS Code Python 경로 자동 적용 설명 보강
</commit_message>
<xml_diff>
--- a/docs/vscode_workspace_usage_guide.docx
+++ b/docs/vscode_workspace_usage_guide.docx
@@ -80,6 +80,19 @@
                 <w:sz w:val="19"/>
               </w:rPr>
               <w:t>`SKN28-3rd-1Team.code-workspace`로 VS Code를 열어야 합니다.</w:t>
+            </w:r>
+          </w:p>
+          <w:p>
+            <w:pPr>
+              <w:spacing w:before="0" w:after="40" w:line="264" w:lineRule="auto"/>
+            </w:pPr>
+            <w:r>
+              <w:rPr>
+                <w:rFonts w:ascii="Apple SD Gothic Neo" w:hAnsi="Apple SD Gothic Neo" w:eastAsia="Apple SD Gothic Neo"/>
+                <w:color w:val="212529"/>
+                <w:sz w:val="19"/>
+              </w:rPr>
+              <w:t>이 방식으로 열면 `backend`, `rag`, `streamlit`이 각각 별도 workspace folder가 되고, 각 폴더의 Python 기본 경로가 `${workspaceFolder}/.venv/bin/python`으로 자동 적용됩니다.</w:t>
             </w:r>
           </w:p>
           <w:p>
@@ -195,7 +208,7 @@
           <w:color w:val="5B6770"/>
           <w:sz w:val="17"/>
         </w:rPr>
-        <w:t>공식 근거: VS Code multi-root workspace는 관련 프로젝트 폴더 여러 개를 한 창에서 함께 작업할 때 쓰는 기능입니다. VS Code 문서는 `.code-workspace` 파일이 상대 경로 폴더 배열과 workspace 설정을 담을 수 있다고 설명합니다.</w:t>
+        <w:t>공식 근거: VS Code multi-root workspace는 관련 프로젝트 폴더 여러 개를 한 창에서 함께 작업할 때 쓰는 기능입니다. VS Code 문서는 `.code-workspace` 파일이 상대 경로 폴더 배열과 workspace 설정을 담을 수 있고, multi-root에서는 폴더별 설정을 둘 수 있다고 설명합니다.</w:t>
       </w:r>
     </w:p>
     <w:p>
@@ -274,6 +287,94 @@
           <w:sz w:val="21"/>
         </w:rPr>
         <w:t>`SKN28-3rd-1Team.code-workspace`는 루트와 주요 서비스 폴더를 한 창에 등록합니다. 중요한 점은 `backend`, `rag`, `streamlit`이 각각 독립된 workspace folder로 등록된다는 것입니다.</w:t>
+      </w:r>
+    </w:p>
+    <w:tbl>
+      <w:tblPr>
+        <w:tblW w:type="dxa" w:w="9360"/>
+        <w:jc w:val="left"/>
+        <w:tblLayout w:type="fixed"/>
+        <w:tblLook w:firstColumn="1" w:firstRow="1" w:lastColumn="0" w:lastRow="0" w:noHBand="0" w:noVBand="1" w:val="04A0"/>
+      </w:tblPr>
+      <w:tblGrid>
+        <w:gridCol w:w="9792"/>
+      </w:tblGrid>
+      <w:tr>
+        <w:trPr>
+          <w:tblHeader w:val="true"/>
+        </w:trPr>
+        <w:tc>
+          <w:tcPr>
+            <w:tcW w:type="dxa" w:w="9792"/>
+            <w:shd w:fill="EEF5FF"/>
+            <w:tcBorders>
+              <w:top w:val="single" w:sz="6" w:space="0" w:color="BBD2FF"/>
+              <w:left w:val="single" w:sz="6" w:space="0" w:color="BBD2FF"/>
+              <w:bottom w:val="single" w:sz="6" w:space="0" w:color="BBD2FF"/>
+              <w:right w:val="single" w:sz="6" w:space="0" w:color="BBD2FF"/>
+            </w:tcBorders>
+            <w:vAlign w:val="center"/>
+          </w:tcPr>
+          <w:p>
+            <w:pPr>
+              <w:spacing w:before="80" w:after="60" w:line="264" w:lineRule="auto"/>
+            </w:pPr>
+            <w:r>
+              <w:rPr>
+                <w:rFonts w:ascii="Apple SD Gothic Neo" w:hAnsi="Apple SD Gothic Neo" w:eastAsia="Apple SD Gothic Neo"/>
+                <w:b/>
+                <w:color w:val="1E3A8A"/>
+                <w:sz w:val="22"/>
+              </w:rPr>
+              <w:t>Python path 자동 적용 방식</w:t>
+            </w:r>
+          </w:p>
+          <w:p>
+            <w:pPr>
+              <w:spacing w:before="0" w:after="40" w:line="264" w:lineRule="auto"/>
+            </w:pPr>
+            <w:r>
+              <w:rPr>
+                <w:rFonts w:ascii="Apple SD Gothic Neo" w:hAnsi="Apple SD Gothic Neo" w:eastAsia="Apple SD Gothic Neo"/>
+                <w:color w:val="212529"/>
+                <w:sz w:val="19"/>
+              </w:rPr>
+              <w:t>맞습니다. 이 리포는 multi-root workspace로 열었을 때 디렉토리별 Python 기본 경로가 잡히도록 설정되어 있습니다.</w:t>
+            </w:r>
+          </w:p>
+          <w:p>
+            <w:pPr>
+              <w:spacing w:before="0" w:after="40" w:line="264" w:lineRule="auto"/>
+            </w:pPr>
+            <w:r>
+              <w:rPr>
+                <w:rFonts w:ascii="Apple SD Gothic Neo" w:hAnsi="Apple SD Gothic Neo" w:eastAsia="Apple SD Gothic Neo"/>
+                <w:color w:val="212529"/>
+                <w:sz w:val="19"/>
+              </w:rPr>
+              <w:t>`backend/.vscode/settings.json`, `rag/.vscode/settings.json`, `streamlit/.vscode/settings.json` 모두 `python.defaultInterpreterPath`를 `${workspaceFolder}/.venv/bin/python`으로 지정합니다.</w:t>
+            </w:r>
+          </w:p>
+          <w:p>
+            <w:pPr>
+              <w:spacing w:before="0" w:after="40" w:line="264" w:lineRule="auto"/>
+            </w:pPr>
+            <w:r>
+              <w:rPr>
+                <w:rFonts w:ascii="Apple SD Gothic Neo" w:hAnsi="Apple SD Gothic Neo" w:eastAsia="Apple SD Gothic Neo"/>
+                <w:color w:val="212529"/>
+                <w:sz w:val="19"/>
+              </w:rPr>
+              <w:t>단, 사용자가 VS Code에서 이미 다른 인터프리터를 수동 선택해 저장해 둔 경우에는 `Python: Select Interpreter`로 해당 서비스의 `.venv/bin/python`을 다시 선택하면 됩니다.</w:t>
+            </w:r>
+          </w:p>
+        </w:tc>
+      </w:tr>
+    </w:tbl>
+    <w:p/>
+    <w:p>
+      <w:r>
+        <w:br w:type="page"/>
       </w:r>
     </w:p>
     <w:p>
@@ -1449,6 +1550,21 @@
           <w:color w:val="212529"/>
           <w:sz w:val="20"/>
         </w:rPr>
+        <w:t>각 서비스 폴더의 Python 기본 인터프리터가 `${workspaceFolder}/.venv/bin/python` 기준으로 자동 적용됩니다.</w:t>
+      </w:r>
+    </w:p>
+    <w:p>
+      <w:pPr>
+        <w:pStyle w:val="ListBullet"/>
+        <w:spacing w:before="0" w:after="80" w:line="269" w:lineRule="auto"/>
+        <w:ind w:left="403" w:hanging="144"/>
+      </w:pPr>
+      <w:r>
+        <w:rPr>
+          <w:rFonts w:ascii="Apple SD Gothic Neo" w:hAnsi="Apple SD Gothic Neo" w:eastAsia="Apple SD Gothic Neo"/>
+          <w:color w:val="212529"/>
+          <w:sz w:val="20"/>
+        </w:rPr>
         <w:t>각 서비스 폴더에서 새 터미널을 열었을 때 해당 서비스 `.venv`가 활성화됩니다.</w:t>
       </w:r>
     </w:p>

</xml_diff>